<commit_message>
Docs: Updated Chapter 6 SRS
</commit_message>
<xml_diff>
--- a/documentation/srs/6-testing/srs_ch6_testing.docx
+++ b/documentation/srs/6-testing/srs_ch6_testing.docx
@@ -5,6 +5,13 @@
     <w:p>
       <w:pPr>
         <w:pStyle w:val="Heading1"/>
+        <w:rPr>
+          <w:rFonts w:ascii="Arial" w:eastAsia="Arial" w:hAnsi="Arial" w:cs="Arial"/>
+          <w:b/>
+          <w:bCs/>
+          <w:sz w:val="32"/>
+          <w:szCs w:val="32"/>
+        </w:rPr>
       </w:pPr>
       <w:r>
         <w:rPr>
@@ -18,6 +25,115 @@
       </w:r>
     </w:p>
     <w:p>
+      <w:r>
+        <w:t xml:space="preserve">Testing is an important phase of </w:t>
+      </w:r>
+      <w:r>
+        <w:t xml:space="preserve">project which </w:t>
+      </w:r>
+      <w:r>
+        <w:t xml:space="preserve">verifies whether the developed </w:t>
+      </w:r>
+      <w:r>
+        <w:t xml:space="preserve">or implement </w:t>
+      </w:r>
+      <w:r>
+        <w:t>system satisfies the specified functional and non-functional requirements.</w:t>
+      </w:r>
+      <w:r>
+        <w:t xml:space="preserve"> and</w:t>
+      </w:r>
+      <w:r>
+        <w:t xml:space="preserve"> </w:t>
+      </w:r>
+      <w:proofErr w:type="gramStart"/>
+      <w:r>
+        <w:t>The</w:t>
+      </w:r>
+      <w:r>
+        <w:t xml:space="preserve"> </w:t>
+      </w:r>
+      <w:r>
+        <w:t xml:space="preserve"> purpose</w:t>
+      </w:r>
+      <w:proofErr w:type="gramEnd"/>
+      <w:r>
+        <w:t xml:space="preserve"> of testing is to identify </w:t>
+      </w:r>
+      <w:proofErr w:type="gramStart"/>
+      <w:r>
+        <w:t>errors,</w:t>
+      </w:r>
+      <w:r>
+        <w:t xml:space="preserve"> </w:t>
+      </w:r>
+      <w:r>
+        <w:t xml:space="preserve"> validate</w:t>
+      </w:r>
+      <w:proofErr w:type="gramEnd"/>
+      <w:r>
+        <w:t xml:space="preserve"> system functionality, check access permission</w:t>
+      </w:r>
+      <w:r>
+        <w:t xml:space="preserve"> like login register </w:t>
+      </w:r>
+      <w:proofErr w:type="spellStart"/>
+      <w:r>
+        <w:t>etc</w:t>
+      </w:r>
+      <w:proofErr w:type="spellEnd"/>
+      <w:r>
+        <w:t xml:space="preserve">, and ensure that </w:t>
+      </w:r>
+      <w:proofErr w:type="gramStart"/>
+      <w:r>
+        <w:t>it</w:t>
+      </w:r>
+      <w:proofErr w:type="gramEnd"/>
+      <w:r>
+        <w:t xml:space="preserve"> CRUD operation is working correctly</w:t>
+      </w:r>
+      <w:r>
+        <w:t>.</w:t>
+      </w:r>
+      <w:r>
+        <w:t xml:space="preserve"> </w:t>
+      </w:r>
+      <w:r>
+        <w:t>Testing will be performed throughout development using a combination</w:t>
+      </w:r>
+      <w:r>
+        <w:t xml:space="preserve"> like</w:t>
+      </w:r>
+      <w:r>
+        <w:t xml:space="preserve"> unit testing, integration testing, system testing, and acceptance testing.</w:t>
+      </w:r>
+      <w:r>
+        <w:t xml:space="preserve"> All </w:t>
+      </w:r>
+      <w:r>
+        <w:t>valid and invalid inputs will be tested to verify the corre</w:t>
+      </w:r>
+      <w:r>
+        <w:t>ct</w:t>
+      </w:r>
+      <w:r>
+        <w:t>, security, and reliability of the system.</w:t>
+      </w:r>
+      <w:r>
+        <w:t xml:space="preserve"> </w:t>
+      </w:r>
+      <w:proofErr w:type="gramStart"/>
+      <w:r>
+        <w:t>So</w:t>
+      </w:r>
+      <w:proofErr w:type="gramEnd"/>
+      <w:r>
+        <w:t xml:space="preserve"> because it will not crash when in production. </w:t>
+      </w:r>
+    </w:p>
+    <w:p/>
+    <w:p>
       <w:pPr>
         <w:pStyle w:val="Heading2"/>
       </w:pPr>
@@ -36,87 +152,447 @@
     </w:p>
     <w:p>
       <w:pPr>
+        <w:pBdr>
+          <w:top w:val="nil"/>
+          <w:left w:val="nil"/>
+          <w:bottom w:val="nil"/>
+          <w:right w:val="nil"/>
+          <w:between w:val="nil"/>
+        </w:pBdr>
         <w:spacing w:before="40" w:after="40"/>
       </w:pPr>
       <w:r>
-        <w:t>Acceptance tests ensure that the system satisfies the requirements set at the beginning of the project. The objective is to verify that the system delivers what the stakeholders desire before its delivery or usage.</w:t>
+        <w:t>Acceptance testing will verify that the Wildlife Information System meets the requirements defined in this Software Requirements Specification (SRS). The system will be considered acceptable when its major functions operate correctly and the specified acceptance criteria are satisfied.</w:t>
+      </w:r>
+      <w:r>
+        <w:t xml:space="preserve"> </w:t>
+      </w:r>
+      <w:r>
+        <w:t>The acceptance criteria are as follows:</w:t>
       </w:r>
     </w:p>
     <w:p>
       <w:pPr>
+        <w:pBdr>
+          <w:top w:val="nil"/>
+          <w:left w:val="nil"/>
+          <w:bottom w:val="nil"/>
+          <w:right w:val="nil"/>
+          <w:between w:val="nil"/>
+        </w:pBdr>
         <w:spacing w:before="40" w:after="40"/>
-        <w:ind w:left="720"/>
-      </w:pPr>
-      <w:r>
-        <w:t>The acceptance criteria are as follows:</w:t>
-      </w:r>
+      </w:pPr>
     </w:p>
     <w:p>
       <w:pPr>
         <w:numPr>
           <w:ilvl w:val="0"/>
-          <w:numId w:val="2"/>
+          <w:numId w:val="3"/>
         </w:numPr>
-        <w:spacing w:before="40"/>
-      </w:pPr>
-      <w:r>
-        <w:t>The users should be able to log into the system and get an access token.</w:t>
+        <w:pBdr>
+          <w:top w:val="nil"/>
+          <w:left w:val="nil"/>
+          <w:bottom w:val="nil"/>
+          <w:right w:val="nil"/>
+          <w:between w:val="nil"/>
+        </w:pBdr>
+        <w:spacing w:before="40" w:after="40"/>
+      </w:pPr>
+      <w:r>
+        <w:t xml:space="preserve">Authorized users should be able to log in successfully and receive </w:t>
+      </w:r>
+      <w:r>
+        <w:t>tokens like session and login token</w:t>
+      </w:r>
+      <w:r>
+        <w:t>.</w:t>
       </w:r>
     </w:p>
     <w:p>
       <w:pPr>
         <w:numPr>
           <w:ilvl w:val="0"/>
-          <w:numId w:val="2"/>
+          <w:numId w:val="3"/>
         </w:numPr>
-      </w:pPr>
-      <w:r>
-        <w:t>The authorized user should add a new animal and retrieve it using the API.</w:t>
+        <w:pBdr>
+          <w:top w:val="nil"/>
+          <w:left w:val="nil"/>
+          <w:bottom w:val="nil"/>
+          <w:right w:val="nil"/>
+          <w:between w:val="nil"/>
+        </w:pBdr>
+        <w:spacing w:before="40" w:after="40"/>
+      </w:pPr>
+      <w:r>
+        <w:t xml:space="preserve">The system should allow users </w:t>
+      </w:r>
+      <w:r>
+        <w:t>which have</w:t>
+      </w:r>
+      <w:r>
+        <w:t xml:space="preserve"> permission to create, retrieve, update, and delete wildlife records.</w:t>
       </w:r>
     </w:p>
     <w:p>
       <w:pPr>
         <w:numPr>
           <w:ilvl w:val="0"/>
-          <w:numId w:val="2"/>
+          <w:numId w:val="3"/>
         </w:numPr>
-      </w:pPr>
-      <w:r>
-        <w:t>The CSV file containing movement information should be able to upload and saved.</w:t>
+        <w:pBdr>
+          <w:top w:val="nil"/>
+          <w:left w:val="nil"/>
+          <w:bottom w:val="nil"/>
+          <w:right w:val="nil"/>
+          <w:between w:val="nil"/>
+        </w:pBdr>
+        <w:spacing w:before="40" w:after="40"/>
+      </w:pPr>
+      <w:r>
+        <w:t xml:space="preserve">The system should validate </w:t>
+      </w:r>
+      <w:r>
+        <w:t xml:space="preserve">Data which is </w:t>
+      </w:r>
+      <w:r>
+        <w:t>newly</w:t>
+      </w:r>
+      <w:r>
+        <w:t xml:space="preserve"> added </w:t>
+      </w:r>
+      <w:r>
+        <w:t>before storing it in the PostgreSQL database.</w:t>
       </w:r>
     </w:p>
     <w:p>
       <w:pPr>
         <w:numPr>
           <w:ilvl w:val="0"/>
-          <w:numId w:val="2"/>
+          <w:numId w:val="3"/>
         </w:numPr>
-      </w:pPr>
-      <w:r>
-        <w:t>The search filters should return the right animals according to species or geographical position.</w:t>
+        <w:pBdr>
+          <w:top w:val="nil"/>
+          <w:left w:val="nil"/>
+          <w:bottom w:val="nil"/>
+          <w:right w:val="nil"/>
+          <w:between w:val="nil"/>
+        </w:pBdr>
+        <w:spacing w:before="40" w:after="40"/>
+      </w:pPr>
+      <w:r>
+        <w:t>Authorized users should be able to upload correctly formatted CSV files</w:t>
+      </w:r>
+      <w:r>
+        <w:t xml:space="preserve"> in which have</w:t>
+      </w:r>
+      <w:r>
+        <w:t xml:space="preserve"> animal movement information</w:t>
+      </w:r>
+      <w:r>
+        <w:t xml:space="preserve"> and other related to it</w:t>
+      </w:r>
+      <w:r>
+        <w:t>.</w:t>
       </w:r>
     </w:p>
     <w:p>
       <w:pPr>
         <w:numPr>
           <w:ilvl w:val="0"/>
-          <w:numId w:val="2"/>
+          <w:numId w:val="3"/>
         </w:numPr>
-      </w:pPr>
-      <w:r>
-        <w:t>API should return proper HTTP error messages (401, 400, 404).</w:t>
+        <w:pBdr>
+          <w:top w:val="nil"/>
+          <w:left w:val="nil"/>
+          <w:bottom w:val="nil"/>
+          <w:right w:val="nil"/>
+          <w:between w:val="nil"/>
+        </w:pBdr>
+        <w:spacing w:before="40" w:after="40"/>
+      </w:pPr>
+      <w:r>
+        <w:t>The system should validate uploaded CSV files and report</w:t>
+      </w:r>
+      <w:r>
+        <w:t xml:space="preserve"> or tell </w:t>
+      </w:r>
+      <w:proofErr w:type="gramStart"/>
+      <w:r>
+        <w:t>error</w:t>
+      </w:r>
+      <w:proofErr w:type="gramEnd"/>
+      <w:r>
+        <w:t xml:space="preserve"> about</w:t>
+      </w:r>
+      <w:r>
+        <w:t xml:space="preserve"> invalid or incomplete records appropriately.</w:t>
+      </w:r>
+      <w:r>
+        <w:t xml:space="preserve"> </w:t>
       </w:r>
     </w:p>
     <w:p>
       <w:pPr>
         <w:numPr>
           <w:ilvl w:val="0"/>
-          <w:numId w:val="2"/>
+          <w:numId w:val="3"/>
         </w:numPr>
-        <w:spacing w:after="40"/>
-      </w:pPr>
-      <w:r>
-        <w:t>The admin should be able to create a new user with the role.</w:t>
+        <w:pBdr>
+          <w:top w:val="nil"/>
+          <w:left w:val="nil"/>
+          <w:bottom w:val="nil"/>
+          <w:right w:val="nil"/>
+          <w:between w:val="nil"/>
+        </w:pBdr>
+        <w:spacing w:before="40" w:after="40"/>
+      </w:pPr>
+      <w:r>
+        <w:t>Users should be able to search</w:t>
+      </w:r>
+      <w:r>
+        <w:t xml:space="preserve"> using </w:t>
+      </w:r>
+      <w:r>
+        <w:t>filter records</w:t>
+      </w:r>
+      <w:r>
+        <w:t xml:space="preserve"> and </w:t>
+      </w:r>
+      <w:r>
+        <w:t>search by query</w:t>
+      </w:r>
+      <w:r>
+        <w:t xml:space="preserve">, such as animal </w:t>
+      </w:r>
+      <w:r>
+        <w:t xml:space="preserve">name and </w:t>
+      </w:r>
+      <w:r>
+        <w:t>species and geographical information.</w:t>
+      </w:r>
+    </w:p>
+    <w:p>
+      <w:pPr>
+        <w:numPr>
+          <w:ilvl w:val="0"/>
+          <w:numId w:val="3"/>
+        </w:numPr>
+        <w:pBdr>
+          <w:top w:val="nil"/>
+          <w:left w:val="nil"/>
+          <w:bottom w:val="nil"/>
+          <w:right w:val="nil"/>
+          <w:between w:val="nil"/>
+        </w:pBdr>
+        <w:spacing w:before="40" w:after="40"/>
+      </w:pPr>
+      <w:r>
+        <w:t xml:space="preserve">The system should return </w:t>
+      </w:r>
+      <w:r>
+        <w:t>correct</w:t>
+      </w:r>
+      <w:r>
+        <w:t xml:space="preserve"> HTTP status code </w:t>
+      </w:r>
+      <w:r>
+        <w:t xml:space="preserve">from backend to check whether system is correct working or not. </w:t>
+      </w:r>
+      <w:r>
+        <w:t>and meaningful error messages for invalid requests, unauthorized access, and records that do not exist.</w:t>
+      </w:r>
+      <w:r>
+        <w:t xml:space="preserve"> And the message will show in </w:t>
+      </w:r>
+      <w:proofErr w:type="gramStart"/>
+      <w:r>
+        <w:t>frontend</w:t>
+      </w:r>
+      <w:proofErr w:type="gramEnd"/>
+      <w:r>
+        <w:t xml:space="preserve"> UI. </w:t>
+      </w:r>
+    </w:p>
+    <w:p>
+      <w:pPr>
+        <w:numPr>
+          <w:ilvl w:val="0"/>
+          <w:numId w:val="3"/>
+        </w:numPr>
+        <w:pBdr>
+          <w:top w:val="nil"/>
+          <w:left w:val="nil"/>
+          <w:bottom w:val="nil"/>
+          <w:right w:val="nil"/>
+          <w:between w:val="nil"/>
+        </w:pBdr>
+        <w:spacing w:before="40" w:after="40"/>
+      </w:pPr>
+      <w:r>
+        <w:t xml:space="preserve">The system should </w:t>
+      </w:r>
+      <w:r>
+        <w:t xml:space="preserve">have </w:t>
+      </w:r>
+      <w:proofErr w:type="gramStart"/>
+      <w:r>
+        <w:t>role</w:t>
+      </w:r>
+      <w:r>
+        <w:t xml:space="preserve"> </w:t>
+      </w:r>
+      <w:r>
+        <w:t>based</w:t>
+      </w:r>
+      <w:proofErr w:type="gramEnd"/>
+      <w:r>
+        <w:t xml:space="preserve"> access control so that users can perform only the operations permitted by their assigned roles.</w:t>
+      </w:r>
+    </w:p>
+    <w:p>
+      <w:pPr>
+        <w:numPr>
+          <w:ilvl w:val="0"/>
+          <w:numId w:val="3"/>
+        </w:numPr>
+        <w:pBdr>
+          <w:top w:val="nil"/>
+          <w:left w:val="nil"/>
+          <w:bottom w:val="nil"/>
+          <w:right w:val="nil"/>
+          <w:between w:val="nil"/>
+        </w:pBdr>
+        <w:spacing w:before="40" w:after="40"/>
+      </w:pPr>
+      <w:r>
+        <w:t xml:space="preserve">Admin can </w:t>
+      </w:r>
+      <w:r>
+        <w:t>create user account and assign appropriate roles.</w:t>
+      </w:r>
+      <w:r>
+        <w:t xml:space="preserve"> And can delete or update information. </w:t>
+      </w:r>
+      <w:proofErr w:type="gramStart"/>
+      <w:r>
+        <w:t>Basically</w:t>
+      </w:r>
+      <w:proofErr w:type="gramEnd"/>
+      <w:r>
+        <w:t xml:space="preserve"> can control All the system overflow. </w:t>
+      </w:r>
+    </w:p>
+    <w:p>
+      <w:pPr>
+        <w:numPr>
+          <w:ilvl w:val="0"/>
+          <w:numId w:val="3"/>
+        </w:numPr>
+        <w:pBdr>
+          <w:top w:val="nil"/>
+          <w:left w:val="nil"/>
+          <w:bottom w:val="nil"/>
+          <w:right w:val="nil"/>
+          <w:between w:val="nil"/>
+        </w:pBdr>
+        <w:spacing w:before="40" w:after="40"/>
+      </w:pPr>
+      <w:r>
+        <w:t>Users should be able to retrieve and export available wildlife information in the supported data formats.</w:t>
+      </w:r>
+    </w:p>
+    <w:p>
+      <w:pPr>
+        <w:numPr>
+          <w:ilvl w:val="0"/>
+          <w:numId w:val="3"/>
+        </w:numPr>
+        <w:pBdr>
+          <w:top w:val="nil"/>
+          <w:left w:val="nil"/>
+          <w:bottom w:val="nil"/>
+          <w:right w:val="nil"/>
+          <w:between w:val="nil"/>
+        </w:pBdr>
+        <w:spacing w:before="40" w:after="40"/>
+      </w:pPr>
+      <w:r>
+        <w:t xml:space="preserve">The system should prevent unauthorized users from accessing </w:t>
+      </w:r>
+      <w:r>
+        <w:t xml:space="preserve">private </w:t>
+      </w:r>
+      <w:r>
+        <w:t>API</w:t>
+      </w:r>
+      <w:r>
+        <w:t xml:space="preserve">. And will add rate limiting </w:t>
+      </w:r>
+      <w:proofErr w:type="gramStart"/>
+      <w:r>
+        <w:t>for</w:t>
+      </w:r>
+      <w:proofErr w:type="gramEnd"/>
+      <w:r>
+        <w:t xml:space="preserve"> </w:t>
+      </w:r>
+      <w:r>
+        <w:t xml:space="preserve">prevent brute force attack. </w:t>
+      </w:r>
+      <w:r>
+        <w:t>and restricted operations.</w:t>
+      </w:r>
+    </w:p>
+    <w:p>
+      <w:pPr>
+        <w:numPr>
+          <w:ilvl w:val="0"/>
+          <w:numId w:val="3"/>
+        </w:numPr>
+        <w:pBdr>
+          <w:top w:val="nil"/>
+          <w:left w:val="nil"/>
+          <w:bottom w:val="nil"/>
+          <w:right w:val="nil"/>
+          <w:between w:val="nil"/>
+        </w:pBdr>
+        <w:spacing w:before="40" w:after="40"/>
+      </w:pPr>
+      <w:r>
+        <w:t xml:space="preserve">The system should store and retrieve </w:t>
+      </w:r>
+      <w:r>
+        <w:t>correctly</w:t>
+      </w:r>
+      <w:r>
+        <w:t xml:space="preserve"> without </w:t>
+      </w:r>
+      <w:r>
+        <w:t xml:space="preserve">any </w:t>
+      </w:r>
+      <w:r>
+        <w:t>data loss or corruption</w:t>
+      </w:r>
+      <w:r>
+        <w:t xml:space="preserve"> or crashed software</w:t>
+      </w:r>
+      <w:r>
+        <w:t>.</w:t>
+      </w:r>
+    </w:p>
+    <w:p>
+      <w:pPr>
+        <w:pBdr>
+          <w:top w:val="nil"/>
+          <w:left w:val="nil"/>
+          <w:bottom w:val="nil"/>
+          <w:right w:val="nil"/>
+          <w:between w:val="nil"/>
+        </w:pBdr>
+        <w:spacing w:before="40" w:after="40"/>
+      </w:pPr>
+      <w:r>
+        <w:t>Acceptance testing will be performed before the final submission to confirm that the implemented system satisfies its specified requirements.</w:t>
       </w:r>
     </w:p>
     <w:p>
@@ -146,6 +622,7 @@
           <w:sz w:val="28"/>
           <w:szCs w:val="28"/>
         </w:rPr>
+        <w:lastRenderedPageBreak/>
         <w:t>6.2 Test Cases</w:t>
       </w:r>
     </w:p>
@@ -1484,7 +1961,23 @@
                 <w:sz w:val="20"/>
                 <w:szCs w:val="20"/>
               </w:rPr>
-              <w:t>Request to export search results</w:t>
+              <w:t xml:space="preserve">Request </w:t>
+            </w:r>
+            <w:proofErr w:type="gramStart"/>
+            <w:r>
+              <w:rPr>
+                <w:sz w:val="20"/>
+                <w:szCs w:val="20"/>
+              </w:rPr>
+              <w:t>to</w:t>
+            </w:r>
+            <w:proofErr w:type="gramEnd"/>
+            <w:r>
+              <w:rPr>
+                <w:sz w:val="20"/>
+                <w:szCs w:val="20"/>
+              </w:rPr>
+              <w:t xml:space="preserve"> export search results</w:t>
             </w:r>
           </w:p>
         </w:tc>
@@ -1641,7 +2134,6 @@
           <w:sz w:val="28"/>
           <w:szCs w:val="28"/>
         </w:rPr>
-        <w:lastRenderedPageBreak/>
         <w:t>6.3 Test Plan</w:t>
       </w:r>
     </w:p>
@@ -1836,10 +2328,28 @@
           <w:b/>
           <w:bCs/>
         </w:rPr>
+        <w:lastRenderedPageBreak/>
         <w:t>Acceptance Testing:</w:t>
       </w:r>
       <w:r>
-        <w:t xml:space="preserve"> The final stage of testing that involves testing against the requirements specification.</w:t>
+        <w:t xml:space="preserve"> The final stage of </w:t>
+      </w:r>
+      <w:proofErr w:type="gramStart"/>
+      <w:r>
+        <w:t>testing</w:t>
+      </w:r>
+      <w:r>
+        <w:t xml:space="preserve"> </w:t>
+      </w:r>
+      <w:r>
+        <w:t>in which</w:t>
+      </w:r>
+      <w:proofErr w:type="gramEnd"/>
+      <w:r>
+        <w:t xml:space="preserve"> </w:t>
+      </w:r>
+      <w:r>
+        <w:t>involves testing against the requirements specification.</w:t>
       </w:r>
     </w:p>
     <w:p>
@@ -2658,7 +3168,6 @@
                 <w:sz w:val="18"/>
                 <w:szCs w:val="18"/>
               </w:rPr>
-              <w:lastRenderedPageBreak/>
               <w:t>FR</w:t>
             </w:r>
           </w:p>
@@ -2890,7 +3399,21 @@
                 <w:sz w:val="18"/>
                 <w:szCs w:val="18"/>
               </w:rPr>
-              <w:t>Comma-Separated Values</w:t>
+              <w:t>Comma</w:t>
+            </w:r>
+            <w:r>
+              <w:rPr>
+                <w:sz w:val="18"/>
+                <w:szCs w:val="18"/>
+              </w:rPr>
+              <w:t xml:space="preserve"> </w:t>
+            </w:r>
+            <w:r>
+              <w:rPr>
+                <w:sz w:val="18"/>
+                <w:szCs w:val="18"/>
+              </w:rPr>
+              <w:t>Separated Values</w:t>
             </w:r>
           </w:p>
         </w:tc>
@@ -3047,7 +3570,28 @@
                 <w:sz w:val="18"/>
                 <w:szCs w:val="18"/>
               </w:rPr>
-              <w:t>Entity-Relationship</w:t>
+              <w:t>Entity</w:t>
+            </w:r>
+            <w:r>
+              <w:rPr>
+                <w:sz w:val="18"/>
+                <w:szCs w:val="18"/>
+              </w:rPr>
+              <w:t xml:space="preserve"> </w:t>
+            </w:r>
+            <w:r>
+              <w:rPr>
+                <w:sz w:val="18"/>
+                <w:szCs w:val="18"/>
+              </w:rPr>
+              <w:t>Relationship</w:t>
+            </w:r>
+            <w:r>
+              <w:rPr>
+                <w:sz w:val="18"/>
+                <w:szCs w:val="18"/>
+              </w:rPr>
+              <w:t xml:space="preserve"> </w:t>
             </w:r>
           </w:p>
         </w:tc>
@@ -3072,6 +3616,155 @@
 <file path=word/numbering.xml><?xml version="1.0" encoding="utf-8"?>
 <w:numbering xmlns:wpc="http://schemas.microsoft.com/office/word/2010/wordprocessingCanvas" xmlns:cx="http://schemas.microsoft.com/office/drawing/2014/chartex" xmlns:cx1="http://schemas.microsoft.com/office/drawing/2015/9/8/chartex" xmlns:cx2="http://schemas.microsoft.com/office/drawing/2015/10/21/chartex" xmlns:cx3="http://schemas.microsoft.com/office/drawing/2016/5/9/chartex" xmlns:cx4="http://schemas.microsoft.com/office/drawing/2016/5/10/chartex" xmlns:cx5="http://schemas.microsoft.com/office/drawing/2016/5/11/chartex" xmlns:cx6="http://schemas.microsoft.com/office/drawing/2016/5/12/chartex" xmlns:cx7="http://schemas.microsoft.com/office/drawing/2016/5/13/chartex" xmlns:cx8="http://schemas.microsoft.com/office/drawing/2016/5/14/chartex" xmlns:mc="http://schemas.openxmlformats.org/markup-compatibility/2006" xmlns:aink="http://schemas.microsoft.com/office/drawing/2016/ink" xmlns:am3d="http://schemas.microsoft.com/office/drawing/2017/model3d" xmlns:o="urn:schemas-microsoft-com:office:office" xmlns:oel="http://schemas.microsoft.com/office/2019/extlst" xmlns:r="http://schemas.openxmlformats.org/officeDocument/2006/relationships" xmlns:m="http://schemas.openxmlformats.org/officeDocument/2006/math" xmlns:v="urn:schemas-microsoft-com:vml" xmlns:wp14="http://schemas.microsoft.com/office/word/2010/wordprocessingDrawing" xmlns:wp="http://schemas.openxmlformats.org/drawingml/2006/wordprocessingDrawing" xmlns:w10="urn:schemas-microsoft-com:office:word" xmlns:w="http://schemas.openxmlformats.org/wordprocessingml/2006/main" xmlns:w14="http://schemas.microsoft.com/office/word/2010/wordml" xmlns:w15="http://schemas.microsoft.com/office/word/2012/wordml" xmlns:w16cex="http://schemas.microsoft.com/office/word/2018/wordml/cex" xmlns:w16cid="http://schemas.microsoft.com/office/word/2016/wordml/cid" xmlns:w16="http://schemas.microsoft.com/office/word/2018/wordml" xmlns:w16du="http://schemas.microsoft.com/office/word/2023/wordml/word16du" xmlns:w16sdtdh="http://schemas.microsoft.com/office/word/2020/wordml/sdtdatahash" xmlns:w16sdtfl="http://schemas.microsoft.com/office/word/2024/wordml/sdtformatlock" xmlns:w16se="http://schemas.microsoft.com/office/word/2015/wordml/symex" xmlns:wpg="http://schemas.microsoft.com/office/word/2010/wordprocessingGroup" xmlns:wpi="http://schemas.microsoft.com/office/word/2010/wordprocessingInk" xmlns:wne="http://schemas.microsoft.com/office/word/2006/wordml" xmlns:wps="http://schemas.microsoft.com/office/word/2010/wordprocessingShape" mc:Ignorable="w14 w15 w16se w16cid w16 w16cex w16sdtdh w16sdtfl w16du wp14">
   <w:abstractNum w:abstractNumId="0" w15:restartNumberingAfterBreak="0">
+    <w:nsid w:val="138757F9"/>
+    <w:multiLevelType w:val="multilevel"/>
+    <w:tmpl w:val="51221BDC"/>
+    <w:lvl w:ilvl="0">
+      <w:start w:val="1"/>
+      <w:numFmt w:val="bullet"/>
+      <w:lvlText w:val=""/>
+      <w:lvlJc w:val="left"/>
+      <w:pPr>
+        <w:tabs>
+          <w:tab w:val="num" w:pos="720"/>
+        </w:tabs>
+        <w:ind w:left="720" w:hanging="360"/>
+      </w:pPr>
+      <w:rPr>
+        <w:rFonts w:ascii="Symbol" w:hAnsi="Symbol" w:hint="default"/>
+        <w:sz w:val="20"/>
+      </w:rPr>
+    </w:lvl>
+    <w:lvl w:ilvl="1" w:tentative="1">
+      <w:start w:val="1"/>
+      <w:numFmt w:val="bullet"/>
+      <w:lvlText w:val="o"/>
+      <w:lvlJc w:val="left"/>
+      <w:pPr>
+        <w:tabs>
+          <w:tab w:val="num" w:pos="1440"/>
+        </w:tabs>
+        <w:ind w:left="1440" w:hanging="360"/>
+      </w:pPr>
+      <w:rPr>
+        <w:rFonts w:ascii="Courier New" w:hAnsi="Courier New" w:hint="default"/>
+        <w:sz w:val="20"/>
+      </w:rPr>
+    </w:lvl>
+    <w:lvl w:ilvl="2" w:tentative="1">
+      <w:start w:val="1"/>
+      <w:numFmt w:val="bullet"/>
+      <w:lvlText w:val=""/>
+      <w:lvlJc w:val="left"/>
+      <w:pPr>
+        <w:tabs>
+          <w:tab w:val="num" w:pos="2160"/>
+        </w:tabs>
+        <w:ind w:left="2160" w:hanging="360"/>
+      </w:pPr>
+      <w:rPr>
+        <w:rFonts w:ascii="Wingdings" w:hAnsi="Wingdings" w:hint="default"/>
+        <w:sz w:val="20"/>
+      </w:rPr>
+    </w:lvl>
+    <w:lvl w:ilvl="3" w:tentative="1">
+      <w:start w:val="1"/>
+      <w:numFmt w:val="bullet"/>
+      <w:lvlText w:val=""/>
+      <w:lvlJc w:val="left"/>
+      <w:pPr>
+        <w:tabs>
+          <w:tab w:val="num" w:pos="2880"/>
+        </w:tabs>
+        <w:ind w:left="2880" w:hanging="360"/>
+      </w:pPr>
+      <w:rPr>
+        <w:rFonts w:ascii="Wingdings" w:hAnsi="Wingdings" w:hint="default"/>
+        <w:sz w:val="20"/>
+      </w:rPr>
+    </w:lvl>
+    <w:lvl w:ilvl="4" w:tentative="1">
+      <w:start w:val="1"/>
+      <w:numFmt w:val="bullet"/>
+      <w:lvlText w:val=""/>
+      <w:lvlJc w:val="left"/>
+      <w:pPr>
+        <w:tabs>
+          <w:tab w:val="num" w:pos="3600"/>
+        </w:tabs>
+        <w:ind w:left="3600" w:hanging="360"/>
+      </w:pPr>
+      <w:rPr>
+        <w:rFonts w:ascii="Wingdings" w:hAnsi="Wingdings" w:hint="default"/>
+        <w:sz w:val="20"/>
+      </w:rPr>
+    </w:lvl>
+    <w:lvl w:ilvl="5" w:tentative="1">
+      <w:start w:val="1"/>
+      <w:numFmt w:val="bullet"/>
+      <w:lvlText w:val=""/>
+      <w:lvlJc w:val="left"/>
+      <w:pPr>
+        <w:tabs>
+          <w:tab w:val="num" w:pos="4320"/>
+        </w:tabs>
+        <w:ind w:left="4320" w:hanging="360"/>
+      </w:pPr>
+      <w:rPr>
+        <w:rFonts w:ascii="Wingdings" w:hAnsi="Wingdings" w:hint="default"/>
+        <w:sz w:val="20"/>
+      </w:rPr>
+    </w:lvl>
+    <w:lvl w:ilvl="6" w:tentative="1">
+      <w:start w:val="1"/>
+      <w:numFmt w:val="bullet"/>
+      <w:lvlText w:val=""/>
+      <w:lvlJc w:val="left"/>
+      <w:pPr>
+        <w:tabs>
+          <w:tab w:val="num" w:pos="5040"/>
+        </w:tabs>
+        <w:ind w:left="5040" w:hanging="360"/>
+      </w:pPr>
+      <w:rPr>
+        <w:rFonts w:ascii="Wingdings" w:hAnsi="Wingdings" w:hint="default"/>
+        <w:sz w:val="20"/>
+      </w:rPr>
+    </w:lvl>
+    <w:lvl w:ilvl="7" w:tentative="1">
+      <w:start w:val="1"/>
+      <w:numFmt w:val="bullet"/>
+      <w:lvlText w:val=""/>
+      <w:lvlJc w:val="left"/>
+      <w:pPr>
+        <w:tabs>
+          <w:tab w:val="num" w:pos="5760"/>
+        </w:tabs>
+        <w:ind w:left="5760" w:hanging="360"/>
+      </w:pPr>
+      <w:rPr>
+        <w:rFonts w:ascii="Wingdings" w:hAnsi="Wingdings" w:hint="default"/>
+        <w:sz w:val="20"/>
+      </w:rPr>
+    </w:lvl>
+    <w:lvl w:ilvl="8" w:tentative="1">
+      <w:start w:val="1"/>
+      <w:numFmt w:val="bullet"/>
+      <w:lvlText w:val=""/>
+      <w:lvlJc w:val="left"/>
+      <w:pPr>
+        <w:tabs>
+          <w:tab w:val="num" w:pos="6480"/>
+        </w:tabs>
+        <w:ind w:left="6480" w:hanging="360"/>
+      </w:pPr>
+      <w:rPr>
+        <w:rFonts w:ascii="Wingdings" w:hAnsi="Wingdings" w:hint="default"/>
+        <w:sz w:val="20"/>
+      </w:rPr>
+    </w:lvl>
+  </w:abstractNum>
+  <w:abstractNum w:abstractNumId="1" w15:restartNumberingAfterBreak="0">
     <w:nsid w:val="32CD27E9"/>
     <w:multiLevelType w:val="multilevel"/>
     <w:tmpl w:val="7E6EA2F8"/>
@@ -3184,7 +3877,7 @@
       </w:rPr>
     </w:lvl>
   </w:abstractNum>
-  <w:abstractNum w:abstractNumId="1" w15:restartNumberingAfterBreak="0">
+  <w:abstractNum w:abstractNumId="2" w15:restartNumberingAfterBreak="0">
     <w:nsid w:val="472E05CB"/>
     <w:multiLevelType w:val="multilevel"/>
     <w:tmpl w:val="0E0C4430"/>
@@ -3298,9 +3991,12 @@
     </w:lvl>
   </w:abstractNum>
   <w:num w:numId="1" w16cid:durableId="855652223">
+    <w:abstractNumId w:val="2"/>
+  </w:num>
+  <w:num w:numId="2" w16cid:durableId="513031861">
     <w:abstractNumId w:val="1"/>
   </w:num>
-  <w:num w:numId="2" w16cid:durableId="513031861">
+  <w:num w:numId="3" w16cid:durableId="532307378">
     <w:abstractNumId w:val="0"/>
   </w:num>
 </w:numbering>
@@ -3916,7 +4612,6 @@
   <w:style w:type="character" w:default="1" w:styleId="DefaultParagraphFont">
     <w:name w:val="Default Paragraph Font"/>
     <w:uiPriority w:val="1"/>
-    <w:semiHidden/>
     <w:unhideWhenUsed/>
   </w:style>
   <w:style w:type="table" w:default="1" w:styleId="TableNormal">

</xml_diff>